<commit_message>
Rewrite highlights in 'We ...' style (all <=85 chars); update template and compiled PDF
</commit_message>
<xml_diff>
--- a/paper/highlights.docx
+++ b/paper/highlights.docx
@@ -4,10 +4,10 @@
   <w:body>
     <w:p>
       <w:pPr>
-        <w:pStyle w:val="ListBullet"/>
+        <w:pStyle w:val="Heading1"/>
       </w:pPr>
       <w:r>
-        <w:t>Scale redundancy is data-dependent: drop P3 on VOC, P5 on VisDrone, zero training.</w:t>
+        <w:t>Highlights</w:t>
       </w:r>
     </w:p>
     <w:p>
@@ -15,7 +15,7 @@
         <w:pStyle w:val="ListBullet"/>
       </w:pPr>
       <w:r>
-        <w:t>A three-point ln-s trend (not a law) reverses the P3/P5 ranking near 12.6%.</w:t>
+        <w:t>We analyze per-scale redundancy on VOC/COCO/VisDrone: it is dataset-dependent.</w:t>
       </w:r>
     </w:p>
     <w:p>
@@ -23,7 +23,7 @@
         <w:pStyle w:val="ListBullet"/>
       </w:pPr>
       <w:r>
-        <w:t>Zero-training P5-drop: identical mAP, -10.4% FLOPs, -28.6% params, 6% faster.</w:t>
+        <w:t>We identify a three-point ln-s trend reversing the P3/P5 ranking near 12.6%.</w:t>
       </w:r>
     </w:p>
     <w:p>
@@ -31,7 +31,7 @@
         <w:pStyle w:val="ListBullet"/>
       </w:pPr>
       <w:r>
-        <w:t>On dense small-object data, scale drop beats resolution scaling (0.173 vs 0.145).</w:t>
+        <w:t>We introduce a zero-training scale drop: -10.4% FLOPs, -28.6% params, same mAP.</w:t>
       </w:r>
     </w:p>
     <w:p>
@@ -39,7 +39,15 @@
         <w:pStyle w:val="ListBullet"/>
       </w:pPr>
       <w:r>
-        <w:t>Cell-level redundancy is a mask-level oracle: block-skipping does not speed up GPU.</w:t>
+        <w:t>We beat input-resolution scaling on dense small-object data (0.173 vs 0.145).</w:t>
+      </w:r>
+    </w:p>
+    <w:p>
+      <w:pPr>
+        <w:pStyle w:val="ListBullet"/>
+      </w:pPr>
+      <w:r>
+        <w:t>We show cell redundancy is only a mask-level oracle; block-skip doesn't speed up GPU.</w:t>
       </w:r>
     </w:p>
     <w:sectPr>
@@ -415,10 +423,6 @@
     <w:name w:val="Normal"/>
     <w:qFormat/>
     <w:rsid w:val="00FC693F"/>
-    <w:rPr>
-      <w:rFonts w:ascii="Calibri" w:hAnsi="Calibri"/>
-      <w:sz w:val="22"/>
-    </w:rPr>
   </w:style>
   <w:style w:type="paragraph" w:styleId="Header">
     <w:name w:val="header"/>

</xml_diff>